<commit_message>
Finish 1st Melekhim Upload
EHYEH ASHER EHYEH
</commit_message>
<xml_diff>
--- a/01 Tanakh/02 Nevi_im/01 Former Prophets/09 Melekhim/Melekhim 01.docx
+++ b/01 Tanakh/02 Nevi_im/01 Former Prophets/09 Melekhim/Melekhim 01.docx
@@ -22,7 +22,7 @@
           <w:szCs w:val="24"/>
           <w:rtl w:val="0"/>
         </w:rPr>
-        <w:t xml:space="preserve">(Book Title)</w:t>
+        <w:t xml:space="preserve">Melekhim</w:t>
       </w:r>
     </w:p>
     <w:p>
@@ -84,6 +84,134 @@
     </w:p>
     <w:p>
       <w:pPr>
+        <w:ind w:left="0" w:firstLine="0"/>
+        <w:rPr>
+          <w:sz w:val="24"/>
+          <w:szCs w:val="24"/>
+        </w:rPr>
+      </w:pPr>
+      <w:r>
+        <w:rPr>
+          <w:rtl w:val="0"/>
+        </w:rPr>
+      </w:r>
+    </w:p>
+    <w:p>
+      <w:pPr>
+        <w:numPr>
+          <w:ilvl w:val="0"/>
+          <w:numId w:val="1"/>
+        </w:numPr>
+        <w:ind w:left="720" w:hanging="360"/>
+        <w:rPr>
+          <w:sz w:val="24"/>
+          <w:szCs w:val="24"/>
+          <w:u w:val="none"/>
+        </w:rPr>
+      </w:pPr>
+      <w:r>
+        <w:rPr>
+          <w:sz w:val="24"/>
+          <w:szCs w:val="24"/>
+          <w:rtl w:val="0"/>
+        </w:rPr>
+        <w:t xml:space="preserve">King David grew old, the years took their toll, and he couldn’t get warm even when they covered him with bedclothes.</w:t>
+      </w:r>
+    </w:p>
+    <w:p>
+      <w:pPr>
+        <w:numPr>
+          <w:ilvl w:val="0"/>
+          <w:numId w:val="1"/>
+        </w:numPr>
+        <w:ind w:left="720" w:hanging="360"/>
+        <w:rPr>
+          <w:sz w:val="24"/>
+          <w:szCs w:val="24"/>
+          <w:u w:val="none"/>
+        </w:rPr>
+      </w:pPr>
+      <w:r>
+        <w:rPr>
+          <w:sz w:val="24"/>
+          <w:szCs w:val="24"/>
+          <w:rtl w:val="0"/>
+        </w:rPr>
+        <w:t xml:space="preserve">His servants said to him, “Let us try to find a young virgin for my lord the king. She can wait on the king and be a companion for him, and she can lie next to you, so that my lord the king will get some heat.”</w:t>
+      </w:r>
+    </w:p>
+    <w:p>
+      <w:pPr>
+        <w:numPr>
+          <w:ilvl w:val="0"/>
+          <w:numId w:val="1"/>
+        </w:numPr>
+        <w:ind w:left="720" w:hanging="360"/>
+        <w:rPr>
+          <w:sz w:val="24"/>
+          <w:szCs w:val="24"/>
+          <w:u w:val="none"/>
+        </w:rPr>
+      </w:pPr>
+      <w:r>
+        <w:rPr>
+          <w:sz w:val="24"/>
+          <w:szCs w:val="24"/>
+          <w:rtl w:val="0"/>
+        </w:rPr>
+        <w:t xml:space="preserve">After looking through all of Isra’el’s territory for a beautiful girl, they found Avishag the Shunamit and brought her to the king.</w:t>
+      </w:r>
+    </w:p>
+    <w:p>
+      <w:pPr>
+        <w:numPr>
+          <w:ilvl w:val="0"/>
+          <w:numId w:val="1"/>
+        </w:numPr>
+        <w:ind w:left="720" w:hanging="360"/>
+        <w:rPr>
+          <w:sz w:val="24"/>
+          <w:szCs w:val="24"/>
+          <w:u w:val="none"/>
+        </w:rPr>
+      </w:pPr>
+      <w:r>
+        <w:rPr>
+          <w:sz w:val="24"/>
+          <w:szCs w:val="24"/>
+          <w:rtl w:val="0"/>
+        </w:rPr>
+        <w:t xml:space="preserve">The girl was very beautiful and became a companion for the king. She took care of him, but the king did not have sexual relations with her.</w:t>
+      </w:r>
+    </w:p>
+    <w:p>
+      <w:pPr>
+        <w:rPr>
+          <w:sz w:val="24"/>
+          <w:szCs w:val="24"/>
+        </w:rPr>
+      </w:pPr>
+      <w:r>
+        <w:rPr>
+          <w:rtl w:val="0"/>
+        </w:rPr>
+      </w:r>
+    </w:p>
+    <w:p>
+      <w:pPr>
+        <w:rPr>
+          <w:sz w:val="24"/>
+          <w:szCs w:val="24"/>
+        </w:rPr>
+      </w:pPr>
+      <w:r>
+        <w:rPr>
+          <w:rtl w:val="0"/>
+        </w:rPr>
+      </w:r>
+    </w:p>
+    <w:p>
+      <w:pPr>
         <w:ind w:firstLine="720"/>
         <w:rPr>
           <w:b w:val="1"/>
@@ -94,228 +222,1177 @@
       </w:pPr>
       <w:r>
         <w:rPr>
-          <w:rtl w:val="0"/>
-        </w:rPr>
-      </w:r>
-    </w:p>
-    <w:p>
-      <w:pPr>
-        <w:numPr>
-          <w:ilvl w:val="0"/>
-          <w:numId w:val="1"/>
-        </w:numPr>
-        <w:ind w:left="720" w:hanging="360"/>
-        <w:rPr>
-          <w:sz w:val="24"/>
-          <w:szCs w:val="24"/>
-          <w:u w:val="none"/>
-        </w:rPr>
-      </w:pPr>
-      <w:r>
-        <w:rPr>
-          <w:sz w:val="24"/>
-          <w:szCs w:val="24"/>
-          <w:rtl w:val="0"/>
-        </w:rPr>
-        <w:t xml:space="preserve">M'lakhim Alef (1 Ki) 1:1-53 CJB</w:t>
-      </w:r>
-    </w:p>
-    <w:p>
-      <w:pPr>
-        <w:numPr>
-          <w:ilvl w:val="0"/>
-          <w:numId w:val="1"/>
-        </w:numPr>
-        <w:ind w:left="720" w:hanging="360"/>
-        <w:rPr>
-          <w:sz w:val="24"/>
-          <w:szCs w:val="24"/>
-          <w:u w:val="none"/>
-        </w:rPr>
-      </w:pPr>
-      <w:r>
-        <w:rPr>
-          <w:sz w:val="24"/>
-          <w:szCs w:val="24"/>
-          <w:rtl w:val="0"/>
-        </w:rPr>
-        <w:t xml:space="preserve">[1] King David grew old, the years took their toll, and he couldn’t get warm even when they covered him with bedclothes. [2] His servants said to him, “Let us try to find a young virgin for my lord the king. She can wait on the king and be a companion for him, and she can lie next to you, so that my lord the king will get some heat.” [3] After looking through all of Isra’el’s territory for a beautiful girl, they found Avishag the Shunamit and brought her to the king. [4] The girl was very beautiful and became a companion for the king. She took care of him, but the king did not have sexual relations with her. [5] Adoniyah the son of Haggit was beginning to claim that he would be king; to this end he organized chariots and horsemen, with fifty men to run ahead of him. [6] (His father had never in his life confronted him by asking, “Why are you behaving this way?” Moreover, he was a very handsome man; he was born next after Avshalom.) [7] He conferred with Yo’av the son of Tz’ruyah and Evyatar the cohen; and they both supported Adoniyah. [8] But Tzadok the cohen, B’nayah the son of Y’hoyada, Natan the prophet, Shim‘i, Re‘i and David’s elite guard were not on Adoniyah’s side. [9] One day Adoniyah killed sheep, oxen and fattened calves at the Stone of Zochelet, by ‘Ein-Rogel. He summoned all his brothers the king’s sons, and all the men of Y’hudah the king’s servants; [10] but he did not summon Natan the prophet, B’nayah, the elite guard or Shlomo his brother. [11] Natan went to Bat-Sheva the mother of Shlomo and said, “Haven’t you heard that Adoniyah the son of Haggit has become king without the knowledge of David our lord? [12] Now, come, please let me give you advice, so that you can save both your own life and that of your son Shlomo. [13] Go, get in to see King David, and say to him, ‘My lord, king, didn’t you swear to your servant, “Your son Shlomo will be king after me; he will sit on my throne”? So why is Adoniyah king?’ [14] Right then, while you are still talking with the king, I will also come in after you and confirm what you are saying.” [15] Bat-Sheva went in to the king in his room. (The king was very old; Avishag the Shunamit was in attendance on the king.) [16] Bat-Sheva bowed, prostrating herself to the king. The king asked, “What do you want?” [17] She answered him, “My lord, you swore by Adonai your God to your servant, ‘Your son Shlomo will be king after me; he will sit on my throne.’ [18] But now, here is Adoniyah ruling as king; and you, my lord the king, don’t know anything about it. [19] He has killed oxen, fattened calves and sheep in great numbers; and he has summoned all the sons of the king, Evyatar the cohen and Yo’av the commander of the army; but he didn’t summon Shlomo your servant. [20] As for you, my lord the king, all Isra’el is watching you; they are waiting for you to tell them who is to sit on the throne of my lord the king after him. [21] If you don’t, then, when my lord the king sleeps with his ancestors, I and my son Shlomo will be considered criminals.” [22] Right then, while she was still talking with the king, Natan the prophet entered. [23] They told the king, “Natan the prophet is here.” After coming into the king’s presence, he prostrated himself before the king with his face to the ground. [24] Natan said, “My lord king, did you say, ‘Adoniyah is to be king after me; he will sit on my throne’? [25] For he has gone down today and killed oxen, fattened calves and sheep in great numbers; and he has summoned all the king’s sons, the commanders of the army and Evyatar the cohen; right now they are eating and drinking in his presence and proclaiming, ‘Long live King Adoniyah!’ [26] But he didn’t summon me your servant, or Tzadok the cohen, or B’nayah the son of Y’hoyada or your servant Shlomo. [27] Is this authorized by my lord the king without your having told your servant who would sit on the throne of my lord the king after him?” [28] King David answered by saying, “Summon Bat-Sheva to me.” She entered the king’s presence and stood before the king. [29] Then the king swore an oath: “As Adonai lives, who has delivered me from all adversity, [30] as I swore to you by Adonai the God of Isra’el, ‘Your son Shlomo will be king after me; he will sit on my throne in my place,’ so will I do today.” [31] Bat-Sheva bowed with her face to the ground, prostrating herself to the king, and said, “Let my lord King David live forever.” [32] King David said, “Summon Tzadok the cohen, Natan the prophet and B’nayah the son of Y’hoyada.” They came before the king. [33] The king said to them, “Take with you the servants of your lord, have Shlomo my son ride on my own mule and bring him down to Gichon. [34] There Tzadok the cohen and Natan the prophet are to anoint him king over Isra’el. Sound the shofar and say, “Long live King Shlomo!” [35] Then escort him back; he is to come and sit on my throne; for he is to take my place as king. I have appointed him to rule over Isra’el and Y’hudah.” [36] B’nayah responded to the king by saying, “Amen! May Adonai, the God of my lord the king, confirm it! [37] Just as Adonai has been with my lord the king, so may he be with Shlomo and make his throne even greater than the throne of my lord King David!” [38] So Tzadok the cohen, Natan the prophet, B’nayah the son of Y’hoyada and the K’reti and P’leti went down, had Shlomo ride on King David’s mule and brought him to Gichon. [39] Tzadok the cohen took the horn of olive oil out of the tent and anointed Shlomo. They sounded the shofar, and all the people shouted, “Long live King Shlomo!” [40] All the people escorted him back, playing flutes and rejoicing greatly, so that the earth shook with the sound. [41] Adoniyah and all his guests heard it while they were finishing their meal; but it was Yo’av who, when he heard the blast on the shofar, asked, “That noise — what’s the meaning of this uproar in the city?” [42] While he was still speaking, there came Yonatan the son of Evyatar the cohen. Adoniyah said, “Come in! You’re a worthy man, so you must be bringing good news!” [43] Yonatan answered Adoniyah, “The truth is, our lord King David has made Shlomo king. [44] Moreover, the king sent with him Tzadok the cohen, Natan the prophet, B’nayah the son of Y’hoyada and the K’reti and P’leti; they had him ride on the king’s mule; [45] and Tzadok the cohen and Natan the prophet anointed him king in Gichon. Then they escorted him back from there rejoicing, so that the city is in an uproar; this is the noise you’ve been hearing. [46] Moreover, Shlomo is now sitting on the throne of the kingdom. [47] More than that, the king’s servants came and blessed our lord King David with these words: ‘May God make the name of Shlomo better than your name and his throne greater than your throne,’ after which the king bowed down on the bed. [48] Finally, the king said, ‘Blessed be Adonai the God of Isra’el, who has given someone to sit on my throne today, when my own eyes can see it.’” [49] At this all Adoniyah’s guests grew frightened; they got up, everyone going his own way. [50] Adoniyah too was afraid because of Shlomo; he got up, went and took hold of the horns of the altar. [51] Shlomo was told, “Here, Adoniyah is terrified of King Shlomo; he has grabbed hold of the horns of the altar and is saying, ‘First let King Shlomo swear to me that he will not have his servant executed.’” [52] Shlomo said, “If he will demonstrate that he is a worthy man, not a hair of his will fall to the earth. But if he is found making trouble, he will die.” [53] So King Shlomo sent, and they brought him down from the altar. He came and prostrated himself before King Shlomo; and Shlomo said to him, ‘Go on home.’”</w:t>
-      </w:r>
-    </w:p>
-    <w:p>
-      <w:pPr>
-        <w:numPr>
-          <w:ilvl w:val="0"/>
-          <w:numId w:val="1"/>
-        </w:numPr>
-        <w:ind w:left="720" w:hanging="360"/>
-        <w:rPr>
-          <w:sz w:val="24"/>
-          <w:szCs w:val="24"/>
-          <w:u w:val="none"/>
-        </w:rPr>
-      </w:pPr>
-      <w:r>
-        <w:rPr>
-          <w:rtl w:val="0"/>
-        </w:rPr>
-      </w:r>
-    </w:p>
-    <w:p>
-      <w:pPr>
-        <w:numPr>
-          <w:ilvl w:val="0"/>
-          <w:numId w:val="1"/>
-        </w:numPr>
-        <w:ind w:left="720" w:hanging="360"/>
-        <w:rPr>
-          <w:sz w:val="24"/>
-          <w:szCs w:val="24"/>
-          <w:u w:val="none"/>
-        </w:rPr>
-      </w:pPr>
-      <w:r>
-        <w:rPr>
-          <w:sz w:val="24"/>
-          <w:szCs w:val="24"/>
-          <w:rtl w:val="0"/>
-        </w:rPr>
-        <w:t xml:space="preserve">https://bible.com/bible/1275/1ki.1.1-53.CJB</w:t>
-      </w:r>
-    </w:p>
-    <w:p>
-      <w:pPr>
-        <w:rPr>
-          <w:sz w:val="24"/>
-          <w:szCs w:val="24"/>
-        </w:rPr>
-      </w:pPr>
-      <w:r>
-        <w:rPr>
-          <w:rtl w:val="0"/>
-        </w:rPr>
-      </w:r>
-    </w:p>
-    <w:p>
-      <w:pPr>
-        <w:rPr>
-          <w:sz w:val="24"/>
-          <w:szCs w:val="24"/>
-        </w:rPr>
-      </w:pPr>
-      <w:r>
-        <w:rPr>
-          <w:rtl w:val="0"/>
-        </w:rPr>
-      </w:r>
-    </w:p>
-    <w:p>
-      <w:pPr>
-        <w:ind w:firstLine="720"/>
-        <w:rPr>
           <w:b w:val="1"/>
           <w:bCs w:val="1"/>
           <w:sz w:val="24"/>
           <w:szCs w:val="24"/>
-        </w:rPr>
-      </w:pPr>
-      <w:r>
+          <w:rtl w:val="0"/>
+        </w:rPr>
+        <w:t xml:space="preserve">(Section Title)</w:t>
+      </w:r>
+    </w:p>
+    <w:p>
+      <w:pPr>
+        <w:ind w:firstLine="720"/>
         <w:rPr>
           <w:b w:val="1"/>
           <w:bCs w:val="1"/>
           <w:sz w:val="24"/>
           <w:szCs w:val="24"/>
-          <w:rtl w:val="0"/>
-        </w:rPr>
-        <w:t xml:space="preserve">(Section Title)</w:t>
-      </w:r>
-    </w:p>
-    <w:p>
-      <w:pPr>
-        <w:ind w:firstLine="720"/>
+        </w:rPr>
+      </w:pPr>
+      <w:r>
+        <w:rPr>
+          <w:rtl w:val="0"/>
+        </w:rPr>
+      </w:r>
+    </w:p>
+    <w:p>
+      <w:pPr>
+        <w:numPr>
+          <w:ilvl w:val="0"/>
+          <w:numId w:val="1"/>
+        </w:numPr>
+        <w:ind w:left="720" w:hanging="360"/>
+        <w:rPr>
+          <w:sz w:val="24"/>
+          <w:szCs w:val="24"/>
+          <w:u w:val="none"/>
+        </w:rPr>
+      </w:pPr>
+      <w:r>
+        <w:rPr>
+          <w:sz w:val="24"/>
+          <w:szCs w:val="24"/>
+          <w:rtl w:val="0"/>
+        </w:rPr>
+        <w:t xml:space="preserve">Adoniyah the son of Haggit was beginning to claim that he would be king; to this end he organized chariots and horsemen, with fifty men to run ahead of him.</w:t>
+      </w:r>
+    </w:p>
+    <w:p>
+      <w:pPr>
+        <w:numPr>
+          <w:ilvl w:val="0"/>
+          <w:numId w:val="1"/>
+        </w:numPr>
+        <w:ind w:left="720" w:hanging="360"/>
+        <w:rPr>
+          <w:sz w:val="24"/>
+          <w:szCs w:val="24"/>
+          <w:u w:val="none"/>
+        </w:rPr>
+      </w:pPr>
+      <w:r>
+        <w:rPr>
+          <w:sz w:val="24"/>
+          <w:szCs w:val="24"/>
+          <w:rtl w:val="0"/>
+        </w:rPr>
+        <w:t xml:space="preserve">(His father had never in his life confronted him by asking, “Why are you behaving this way?” Moreover, he was a very handsome man; he was born next after Avshalom.)</w:t>
+      </w:r>
+    </w:p>
+    <w:p>
+      <w:pPr>
+        <w:numPr>
+          <w:ilvl w:val="0"/>
+          <w:numId w:val="1"/>
+        </w:numPr>
+        <w:ind w:left="720" w:hanging="360"/>
+        <w:rPr>
+          <w:sz w:val="24"/>
+          <w:szCs w:val="24"/>
+          <w:u w:val="none"/>
+        </w:rPr>
+      </w:pPr>
+      <w:r>
+        <w:rPr>
+          <w:sz w:val="24"/>
+          <w:szCs w:val="24"/>
+          <w:rtl w:val="0"/>
+        </w:rPr>
+        <w:t xml:space="preserve">He conferred with Yo’av the son of Tz’ruyah and Evyatar the cohen; and they both supported Adoniyah.</w:t>
+      </w:r>
+    </w:p>
+    <w:p>
+      <w:pPr>
+        <w:numPr>
+          <w:ilvl w:val="0"/>
+          <w:numId w:val="1"/>
+        </w:numPr>
+        <w:ind w:left="720" w:hanging="360"/>
+        <w:rPr>
+          <w:sz w:val="24"/>
+          <w:szCs w:val="24"/>
+          <w:u w:val="none"/>
+        </w:rPr>
+      </w:pPr>
+      <w:r>
+        <w:rPr>
+          <w:sz w:val="24"/>
+          <w:szCs w:val="24"/>
+          <w:rtl w:val="0"/>
+        </w:rPr>
+        <w:t xml:space="preserve">But Tzadok the cohen, B’nayah the son of Y’hoyada, Natan the prophet, Shim‘i, Re‘i and David’s elite guard were not on Adoniyah’s side.</w:t>
+      </w:r>
+    </w:p>
+    <w:p>
+      <w:pPr>
+        <w:numPr>
+          <w:ilvl w:val="0"/>
+          <w:numId w:val="1"/>
+        </w:numPr>
+        <w:ind w:left="720" w:hanging="360"/>
+        <w:rPr>
+          <w:sz w:val="24"/>
+          <w:szCs w:val="24"/>
+          <w:u w:val="none"/>
+        </w:rPr>
+      </w:pPr>
+      <w:r>
+        <w:rPr>
+          <w:sz w:val="24"/>
+          <w:szCs w:val="24"/>
+          <w:rtl w:val="0"/>
+        </w:rPr>
+        <w:t xml:space="preserve">One day Adoniyah killed sheep, oxen and fattened calves at the Stone of Zochelet, by ‘Ein-Rogel. He summoned all his brothers the king’s sons, and all the men of Y’hudah the king’s servants;</w:t>
+      </w:r>
+    </w:p>
+    <w:p>
+      <w:pPr>
+        <w:numPr>
+          <w:ilvl w:val="0"/>
+          <w:numId w:val="1"/>
+        </w:numPr>
+        <w:ind w:left="720" w:hanging="360"/>
+        <w:rPr>
+          <w:sz w:val="24"/>
+          <w:szCs w:val="24"/>
+          <w:u w:val="none"/>
+        </w:rPr>
+      </w:pPr>
+      <w:r>
+        <w:rPr>
+          <w:sz w:val="24"/>
+          <w:szCs w:val="24"/>
+          <w:rtl w:val="0"/>
+        </w:rPr>
+        <w:t xml:space="preserve">but he did not summon Natan the prophet, B’nayah, the elite guard or Shlomo his brother.</w:t>
+      </w:r>
+    </w:p>
+    <w:p>
+      <w:pPr>
+        <w:numPr>
+          <w:ilvl w:val="0"/>
+          <w:numId w:val="1"/>
+        </w:numPr>
+        <w:ind w:left="720" w:hanging="360"/>
+        <w:rPr>
+          <w:sz w:val="24"/>
+          <w:szCs w:val="24"/>
+          <w:u w:val="none"/>
+        </w:rPr>
+      </w:pPr>
+      <w:r>
+        <w:rPr>
+          <w:sz w:val="24"/>
+          <w:szCs w:val="24"/>
+          <w:rtl w:val="0"/>
+        </w:rPr>
+        <w:t xml:space="preserve">Natan went to Bat-Sheva the mother of Shlomo and said, “Haven’t you heard that Adoniyah the son of Haggit has become king without the knowledge of David our lord?</w:t>
+      </w:r>
+    </w:p>
+    <w:p>
+      <w:pPr>
+        <w:numPr>
+          <w:ilvl w:val="0"/>
+          <w:numId w:val="1"/>
+        </w:numPr>
+        <w:ind w:left="720" w:hanging="360"/>
+        <w:rPr>
+          <w:sz w:val="24"/>
+          <w:szCs w:val="24"/>
+          <w:u w:val="none"/>
+        </w:rPr>
+      </w:pPr>
+      <w:r>
+        <w:rPr>
+          <w:sz w:val="24"/>
+          <w:szCs w:val="24"/>
+          <w:rtl w:val="0"/>
+        </w:rPr>
+        <w:t xml:space="preserve">Now, come, please let me give you advice, so that you can save both your own life and that of your son Shlomo.</w:t>
+      </w:r>
+    </w:p>
+    <w:p>
+      <w:pPr>
+        <w:ind w:left="720" w:firstLine="0"/>
+        <w:rPr>
+          <w:sz w:val="24"/>
+          <w:szCs w:val="24"/>
+        </w:rPr>
+      </w:pPr>
+      <w:r>
+        <w:rPr>
+          <w:rtl w:val="0"/>
+        </w:rPr>
+      </w:r>
+    </w:p>
+    <w:p>
+      <w:pPr>
+        <w:ind w:left="720" w:firstLine="0"/>
+        <w:rPr>
+          <w:sz w:val="24"/>
+          <w:szCs w:val="24"/>
+        </w:rPr>
+      </w:pPr>
+      <w:r>
+        <w:rPr>
+          <w:rtl w:val="0"/>
+        </w:rPr>
+      </w:r>
+    </w:p>
+    <w:p>
+      <w:pPr>
+        <w:ind w:left="720" w:firstLine="0"/>
+        <w:rPr>
+          <w:sz w:val="24"/>
+          <w:szCs w:val="24"/>
+        </w:rPr>
+      </w:pPr>
+      <w:r>
+        <w:rPr>
+          <w:rtl w:val="0"/>
+        </w:rPr>
+      </w:r>
+    </w:p>
+    <w:p>
+      <w:pPr>
+        <w:jc w:val="center"/>
         <w:rPr>
           <w:b w:val="1"/>
           <w:bCs w:val="1"/>
-          <w:sz w:val="24"/>
-          <w:szCs w:val="24"/>
-        </w:rPr>
-      </w:pPr>
-      <w:r>
-        <w:rPr>
-          <w:rtl w:val="0"/>
-        </w:rPr>
-      </w:r>
-    </w:p>
-    <w:p>
-      <w:pPr>
-        <w:numPr>
-          <w:ilvl w:val="0"/>
-          <w:numId w:val="1"/>
-        </w:numPr>
-        <w:ind w:left="720" w:hanging="360"/>
-        <w:rPr>
-          <w:sz w:val="24"/>
-          <w:szCs w:val="24"/>
-          <w:u w:val="none"/>
-        </w:rPr>
-      </w:pPr>
-      <w:r>
-        <w:rPr>
-          <w:sz w:val="24"/>
-          <w:szCs w:val="24"/>
-          <w:rtl w:val="0"/>
-        </w:rPr>
-        <w:t xml:space="preserve">Text</w:t>
-      </w:r>
-    </w:p>
-    <w:p>
-      <w:pPr>
-        <w:rPr>
-          <w:sz w:val="24"/>
-          <w:szCs w:val="24"/>
-        </w:rPr>
-      </w:pPr>
-      <w:r>
-        <w:rPr>
-          <w:rtl w:val="0"/>
-        </w:rPr>
+          <w:color w:val="999999"/>
+          <w:sz w:val="24"/>
+          <w:szCs w:val="24"/>
+        </w:rPr>
+      </w:pPr>
+      <w:r>
+        <w:rPr>
+          <w:b w:val="1"/>
+          <w:bCs w:val="1"/>
+          <w:color w:val="999999"/>
+          <w:sz w:val="24"/>
+          <w:szCs w:val="24"/>
+          <w:rtl w:val="0"/>
+        </w:rPr>
+        <w:t xml:space="preserve">Melekhim</w:t>
       </w:r>
     </w:p>
     <w:p>
       <w:pPr>
         <w:jc w:val="center"/>
+        <w:rPr>
+          <w:sz w:val="24"/>
+          <w:szCs w:val="24"/>
+        </w:rPr>
+      </w:pPr>
+      <w:r>
         <w:rPr>
           <w:b w:val="1"/>
           <w:bCs w:val="1"/>
           <w:sz w:val="40"/>
           <w:szCs w:val="40"/>
-        </w:rPr>
-      </w:pPr>
-      <w:r>
+          <w:rtl w:val="0"/>
+        </w:rPr>
+        <w:t xml:space="preserve">1</w:t>
+      </w:r>
+      <w:r>
+        <w:rPr>
+          <w:rtl w:val="0"/>
+        </w:rPr>
+      </w:r>
+    </w:p>
+    <w:p>
+      <w:pPr>
+        <w:ind w:left="720" w:firstLine="0"/>
+        <w:rPr>
+          <w:sz w:val="24"/>
+          <w:szCs w:val="24"/>
+        </w:rPr>
+      </w:pPr>
+      <w:r>
+        <w:rPr>
+          <w:rtl w:val="0"/>
+        </w:rPr>
+      </w:r>
+    </w:p>
+    <w:p>
+      <w:pPr>
+        <w:ind w:left="720" w:firstLine="0"/>
+        <w:rPr>
+          <w:sz w:val="24"/>
+          <w:szCs w:val="24"/>
+        </w:rPr>
+      </w:pPr>
+      <w:r>
+        <w:rPr>
+          <w:rtl w:val="0"/>
+        </w:rPr>
+      </w:r>
+    </w:p>
+    <w:p>
+      <w:pPr>
+        <w:numPr>
+          <w:ilvl w:val="0"/>
+          <w:numId w:val="1"/>
+        </w:numPr>
+        <w:ind w:left="720" w:hanging="360"/>
+        <w:rPr>
+          <w:sz w:val="24"/>
+          <w:szCs w:val="24"/>
+          <w:u w:val="none"/>
+        </w:rPr>
+      </w:pPr>
+      <w:r>
+        <w:rPr>
+          <w:sz w:val="24"/>
+          <w:szCs w:val="24"/>
+          <w:rtl w:val="0"/>
+        </w:rPr>
+        <w:t xml:space="preserve">Go, get in to see King David, and say to him, ‘My lord, king, didn’t you swear to your servant, “Your son Shlomo will be king after me; he will sit on my throne”? So why is Adoniyah king?’</w:t>
+      </w:r>
+    </w:p>
+    <w:p>
+      <w:pPr>
+        <w:numPr>
+          <w:ilvl w:val="0"/>
+          <w:numId w:val="1"/>
+        </w:numPr>
+        <w:ind w:left="720" w:hanging="360"/>
+        <w:rPr>
+          <w:sz w:val="24"/>
+          <w:szCs w:val="24"/>
+          <w:u w:val="none"/>
+        </w:rPr>
+      </w:pPr>
+      <w:r>
+        <w:rPr>
+          <w:sz w:val="24"/>
+          <w:szCs w:val="24"/>
+          <w:rtl w:val="0"/>
+        </w:rPr>
+        <w:t xml:space="preserve">Right then, while you are still talking with the king, I will also come in after you and confirm what you are saying.”</w:t>
+      </w:r>
+    </w:p>
+    <w:p>
+      <w:pPr>
+        <w:numPr>
+          <w:ilvl w:val="0"/>
+          <w:numId w:val="1"/>
+        </w:numPr>
+        <w:ind w:left="720" w:hanging="360"/>
+        <w:rPr>
+          <w:sz w:val="24"/>
+          <w:szCs w:val="24"/>
+          <w:u w:val="none"/>
+        </w:rPr>
+      </w:pPr>
+      <w:r>
+        <w:rPr>
+          <w:sz w:val="24"/>
+          <w:szCs w:val="24"/>
+          <w:rtl w:val="0"/>
+        </w:rPr>
+        <w:t xml:space="preserve">Bat-Sheva went in to the king in his room. (The king was very old; Avishag the Shunamit was in attendance on the king.)</w:t>
+      </w:r>
+    </w:p>
+    <w:p>
+      <w:pPr>
+        <w:numPr>
+          <w:ilvl w:val="0"/>
+          <w:numId w:val="1"/>
+        </w:numPr>
+        <w:ind w:left="720" w:hanging="360"/>
+        <w:rPr>
+          <w:sz w:val="24"/>
+          <w:szCs w:val="24"/>
+          <w:u w:val="none"/>
+        </w:rPr>
+      </w:pPr>
+      <w:r>
+        <w:rPr>
+          <w:sz w:val="24"/>
+          <w:szCs w:val="24"/>
+          <w:rtl w:val="0"/>
+        </w:rPr>
+        <w:t xml:space="preserve">Bat-Sheva bowed, prostrating herself to the king. The king asked, “What do you want?”</w:t>
+      </w:r>
+    </w:p>
+    <w:p>
+      <w:pPr>
+        <w:numPr>
+          <w:ilvl w:val="0"/>
+          <w:numId w:val="1"/>
+        </w:numPr>
+        <w:ind w:left="720" w:hanging="360"/>
+        <w:rPr>
+          <w:sz w:val="24"/>
+          <w:szCs w:val="24"/>
+          <w:u w:val="none"/>
+        </w:rPr>
+      </w:pPr>
+      <w:r>
+        <w:rPr>
+          <w:sz w:val="24"/>
+          <w:szCs w:val="24"/>
+          <w:rtl w:val="0"/>
+        </w:rPr>
+        <w:t xml:space="preserve">She answered him, “My lord, you swore by YIHOVEH ELOHEIKHA to your servant, ‘Your son Shlomo will be king after me; he will sit on my throne.’</w:t>
+      </w:r>
+    </w:p>
+    <w:p>
+      <w:pPr>
+        <w:numPr>
+          <w:ilvl w:val="0"/>
+          <w:numId w:val="1"/>
+        </w:numPr>
+        <w:ind w:left="720" w:hanging="360"/>
+        <w:rPr>
+          <w:sz w:val="24"/>
+          <w:szCs w:val="24"/>
+          <w:u w:val="none"/>
+        </w:rPr>
+      </w:pPr>
+      <w:r>
+        <w:rPr>
+          <w:sz w:val="24"/>
+          <w:szCs w:val="24"/>
+          <w:rtl w:val="0"/>
+        </w:rPr>
+        <w:t xml:space="preserve">But now, here is Adoniyah ruling as king; and you, my lord the king, don’t know anything about it.</w:t>
+      </w:r>
+    </w:p>
+    <w:p>
+      <w:pPr>
+        <w:numPr>
+          <w:ilvl w:val="0"/>
+          <w:numId w:val="1"/>
+        </w:numPr>
+        <w:ind w:left="720" w:hanging="360"/>
+        <w:rPr>
+          <w:sz w:val="24"/>
+          <w:szCs w:val="24"/>
+          <w:u w:val="none"/>
+        </w:rPr>
+      </w:pPr>
+      <w:r>
+        <w:rPr>
+          <w:sz w:val="24"/>
+          <w:szCs w:val="24"/>
+          <w:rtl w:val="0"/>
+        </w:rPr>
+        <w:t xml:space="preserve">He has killed oxen, fattened calves and sheep in great numbers; and he has summoned all the sons of the king, Evyatar the cohen and Yo’av the commander of the army; but he didn’t summon Shlomo your servant.</w:t>
+      </w:r>
+    </w:p>
+    <w:p>
+      <w:pPr>
+        <w:numPr>
+          <w:ilvl w:val="0"/>
+          <w:numId w:val="1"/>
+        </w:numPr>
+        <w:ind w:left="720" w:hanging="360"/>
+        <w:rPr>
+          <w:sz w:val="24"/>
+          <w:szCs w:val="24"/>
+          <w:u w:val="none"/>
+        </w:rPr>
+      </w:pPr>
+      <w:r>
+        <w:rPr>
+          <w:sz w:val="24"/>
+          <w:szCs w:val="24"/>
+          <w:rtl w:val="0"/>
+        </w:rPr>
+        <w:t xml:space="preserve">As for you, my lord the king, all Isra’el is watching you; they are waiting for you to tell them who is to sit on the throne of my lord the king after him.</w:t>
+      </w:r>
+    </w:p>
+    <w:p>
+      <w:pPr>
+        <w:numPr>
+          <w:ilvl w:val="0"/>
+          <w:numId w:val="1"/>
+        </w:numPr>
+        <w:ind w:left="720" w:hanging="360"/>
+        <w:rPr>
+          <w:sz w:val="24"/>
+          <w:szCs w:val="24"/>
+          <w:u w:val="none"/>
+        </w:rPr>
+      </w:pPr>
+      <w:r>
+        <w:rPr>
+          <w:sz w:val="24"/>
+          <w:szCs w:val="24"/>
+          <w:rtl w:val="0"/>
+        </w:rPr>
+        <w:t xml:space="preserve">If you don’t, then, when my lord the king sleeps with his ancestors, I and my son Shlomo will be considered criminals.”</w:t>
+      </w:r>
+    </w:p>
+    <w:p>
+      <w:pPr>
+        <w:numPr>
+          <w:ilvl w:val="0"/>
+          <w:numId w:val="1"/>
+        </w:numPr>
+        <w:ind w:left="720" w:hanging="360"/>
+        <w:rPr>
+          <w:sz w:val="24"/>
+          <w:szCs w:val="24"/>
+          <w:u w:val="none"/>
+        </w:rPr>
+      </w:pPr>
+      <w:r>
+        <w:rPr>
+          <w:sz w:val="24"/>
+          <w:szCs w:val="24"/>
+          <w:rtl w:val="0"/>
+        </w:rPr>
+        <w:t xml:space="preserve">Right then, while she was still talking with the king, Natan the prophet entered.</w:t>
+      </w:r>
+    </w:p>
+    <w:p>
+      <w:pPr>
+        <w:numPr>
+          <w:ilvl w:val="0"/>
+          <w:numId w:val="1"/>
+        </w:numPr>
+        <w:ind w:left="720" w:hanging="360"/>
+        <w:rPr>
+          <w:sz w:val="24"/>
+          <w:szCs w:val="24"/>
+          <w:u w:val="none"/>
+        </w:rPr>
+      </w:pPr>
+      <w:r>
+        <w:rPr>
+          <w:sz w:val="24"/>
+          <w:szCs w:val="24"/>
+          <w:rtl w:val="0"/>
+        </w:rPr>
+        <w:t xml:space="preserve">They told the king, “Natan the prophet is here.” After coming into the king’s presence, he prostrated himself before the king with his face to the ground.</w:t>
+      </w:r>
+    </w:p>
+    <w:p>
+      <w:pPr>
+        <w:numPr>
+          <w:ilvl w:val="0"/>
+          <w:numId w:val="1"/>
+        </w:numPr>
+        <w:ind w:left="720" w:hanging="360"/>
+        <w:rPr>
+          <w:sz w:val="24"/>
+          <w:szCs w:val="24"/>
+          <w:u w:val="none"/>
+        </w:rPr>
+      </w:pPr>
+      <w:r>
+        <w:rPr>
+          <w:sz w:val="24"/>
+          <w:szCs w:val="24"/>
+          <w:rtl w:val="0"/>
+        </w:rPr>
+        <w:t xml:space="preserve">Natan said, “My lord king, did you say, ‘Adoniyah is to be king after me; he will sit on my throne’?</w:t>
+      </w:r>
+    </w:p>
+    <w:p>
+      <w:pPr>
+        <w:numPr>
+          <w:ilvl w:val="0"/>
+          <w:numId w:val="1"/>
+        </w:numPr>
+        <w:ind w:left="720" w:hanging="360"/>
+        <w:rPr>
+          <w:sz w:val="24"/>
+          <w:szCs w:val="24"/>
+          <w:u w:val="none"/>
+        </w:rPr>
+      </w:pPr>
+      <w:r>
+        <w:rPr>
+          <w:sz w:val="24"/>
+          <w:szCs w:val="24"/>
+          <w:rtl w:val="0"/>
+        </w:rPr>
+        <w:t xml:space="preserve">For he has gone down today and killed oxen, fattened calves and sheep in great numbers; and he has summoned all the king’s sons, the commanders of the army and Evyatar the cohen; right now they are eating and drinking in his presence and proclaiming, ‘Long live King Adoniyah!’</w:t>
+      </w:r>
+    </w:p>
+    <w:p>
+      <w:pPr>
+        <w:numPr>
+          <w:ilvl w:val="0"/>
+          <w:numId w:val="1"/>
+        </w:numPr>
+        <w:ind w:left="720" w:hanging="360"/>
+        <w:rPr>
+          <w:sz w:val="24"/>
+          <w:szCs w:val="24"/>
+          <w:u w:val="none"/>
+        </w:rPr>
+      </w:pPr>
+      <w:r>
+        <w:rPr>
+          <w:sz w:val="24"/>
+          <w:szCs w:val="24"/>
+          <w:rtl w:val="0"/>
+        </w:rPr>
+        <w:t xml:space="preserve">But he didn’t summon me your servant, or Tzadok the cohen, or B’nayah the son of Y’hoyada or your servant Shlomo.</w:t>
+      </w:r>
+    </w:p>
+    <w:p>
+      <w:pPr>
+        <w:numPr>
+          <w:ilvl w:val="0"/>
+          <w:numId w:val="1"/>
+        </w:numPr>
+        <w:ind w:left="720" w:hanging="360"/>
+        <w:rPr>
+          <w:sz w:val="24"/>
+          <w:szCs w:val="24"/>
+          <w:u w:val="none"/>
+        </w:rPr>
+      </w:pPr>
+      <w:r>
+        <w:rPr>
+          <w:sz w:val="24"/>
+          <w:szCs w:val="24"/>
+          <w:rtl w:val="0"/>
+        </w:rPr>
+        <w:t xml:space="preserve">Is this authorized by my lord the king without your having told your servant who would sit on the throne of my lord the king after him?”</w:t>
+      </w:r>
+    </w:p>
+    <w:p>
+      <w:pPr>
+        <w:rPr>
+          <w:sz w:val="24"/>
+          <w:szCs w:val="24"/>
+        </w:rPr>
+      </w:pPr>
+      <w:r>
+        <w:rPr>
+          <w:rtl w:val="0"/>
+        </w:rPr>
+      </w:r>
+    </w:p>
+    <w:p>
+      <w:pPr>
+        <w:rPr>
+          <w:sz w:val="24"/>
+          <w:szCs w:val="24"/>
+        </w:rPr>
+      </w:pPr>
+      <w:r>
+        <w:rPr>
+          <w:rtl w:val="0"/>
+        </w:rPr>
+      </w:r>
+    </w:p>
+    <w:p>
+      <w:pPr>
+        <w:rPr>
+          <w:sz w:val="24"/>
+          <w:szCs w:val="24"/>
+        </w:rPr>
+      </w:pPr>
+      <w:r>
+        <w:rPr>
+          <w:rtl w:val="0"/>
+        </w:rPr>
+      </w:r>
+    </w:p>
+    <w:p>
+      <w:pPr>
+        <w:jc w:val="center"/>
         <w:rPr>
           <w:b w:val="1"/>
           <w:bCs w:val="1"/>
           <w:color w:val="999999"/>
           <w:sz w:val="24"/>
           <w:szCs w:val="24"/>
-          <w:rtl w:val="0"/>
-        </w:rPr>
-        <w:t xml:space="preserve">(Book Title)</w:t>
-      </w:r>
-      <w:r>
-        <w:rPr>
-          <w:rtl w:val="0"/>
-        </w:rPr>
+        </w:rPr>
+      </w:pPr>
+      <w:r>
+        <w:rPr>
+          <w:b w:val="1"/>
+          <w:bCs w:val="1"/>
+          <w:color w:val="999999"/>
+          <w:sz w:val="24"/>
+          <w:szCs w:val="24"/>
+          <w:rtl w:val="0"/>
+        </w:rPr>
+        <w:t xml:space="preserve">Melekhim</w:t>
       </w:r>
     </w:p>
     <w:p>
       <w:pPr>
         <w:jc w:val="center"/>
+        <w:rPr>
+          <w:sz w:val="24"/>
+          <w:szCs w:val="24"/>
+        </w:rPr>
+      </w:pPr>
+      <w:r>
         <w:rPr>
           <w:b w:val="1"/>
           <w:bCs w:val="1"/>
           <w:sz w:val="40"/>
           <w:szCs w:val="40"/>
+          <w:rtl w:val="0"/>
+        </w:rPr>
+        <w:t xml:space="preserve">1</w:t>
+      </w:r>
+      <w:r>
+        <w:rPr>
+          <w:rtl w:val="0"/>
+        </w:rPr>
+      </w:r>
+    </w:p>
+    <w:p>
+      <w:pPr>
+        <w:rPr>
+          <w:sz w:val="24"/>
+          <w:szCs w:val="24"/>
+        </w:rPr>
+      </w:pPr>
+      <w:r>
+        <w:rPr>
+          <w:rtl w:val="0"/>
+        </w:rPr>
+      </w:r>
+    </w:p>
+    <w:p>
+      <w:pPr>
+        <w:ind w:firstLine="720"/>
+        <w:rPr>
+          <w:b w:val="1"/>
+          <w:bCs w:val="1"/>
+          <w:sz w:val="24"/>
+          <w:szCs w:val="24"/>
+        </w:rPr>
+      </w:pPr>
+      <w:r>
+        <w:rPr>
+          <w:b w:val="1"/>
+          <w:bCs w:val="1"/>
+          <w:sz w:val="24"/>
+          <w:szCs w:val="24"/>
+          <w:rtl w:val="0"/>
+        </w:rPr>
+        <w:t xml:space="preserve">(Section Title)</w:t>
+      </w:r>
+    </w:p>
+    <w:p>
+      <w:pPr>
+        <w:ind w:firstLine="720"/>
+        <w:rPr>
+          <w:b w:val="1"/>
+          <w:bCs w:val="1"/>
+          <w:sz w:val="24"/>
+          <w:szCs w:val="24"/>
+        </w:rPr>
+      </w:pPr>
+      <w:r>
+        <w:rPr>
+          <w:rtl w:val="0"/>
+        </w:rPr>
+      </w:r>
+    </w:p>
+    <w:p>
+      <w:pPr>
+        <w:numPr>
+          <w:ilvl w:val="0"/>
+          <w:numId w:val="1"/>
+        </w:numPr>
+        <w:ind w:left="720" w:hanging="360"/>
+        <w:rPr>
+          <w:sz w:val="24"/>
+          <w:szCs w:val="24"/>
+          <w:u w:val="none"/>
+        </w:rPr>
+      </w:pPr>
+      <w:r>
+        <w:rPr>
+          <w:sz w:val="24"/>
+          <w:szCs w:val="24"/>
+          <w:rtl w:val="0"/>
+        </w:rPr>
+        <w:t xml:space="preserve">King David answered by saying, “Summon Bat-Sheva to me.” She entered the king’s presence and stood before the king.</w:t>
+      </w:r>
+    </w:p>
+    <w:p>
+      <w:pPr>
+        <w:numPr>
+          <w:ilvl w:val="0"/>
+          <w:numId w:val="1"/>
+        </w:numPr>
+        <w:ind w:left="720" w:hanging="360"/>
+        <w:rPr>
+          <w:sz w:val="24"/>
+          <w:szCs w:val="24"/>
+          <w:u w:val="none"/>
+        </w:rPr>
+      </w:pPr>
+      <w:r>
+        <w:rPr>
+          <w:sz w:val="24"/>
+          <w:szCs w:val="24"/>
+          <w:rtl w:val="0"/>
+        </w:rPr>
+        <w:t xml:space="preserve">Then the king swore an oath: “As YIHOVEH lives, who has delivered me from all adversity,</w:t>
+      </w:r>
+    </w:p>
+    <w:p>
+      <w:pPr>
+        <w:numPr>
+          <w:ilvl w:val="0"/>
+          <w:numId w:val="1"/>
+        </w:numPr>
+        <w:ind w:left="720" w:hanging="360"/>
+        <w:rPr>
+          <w:sz w:val="24"/>
+          <w:szCs w:val="24"/>
+          <w:u w:val="none"/>
+        </w:rPr>
+      </w:pPr>
+      <w:r>
+        <w:rPr>
+          <w:sz w:val="24"/>
+          <w:szCs w:val="24"/>
+          <w:rtl w:val="0"/>
+        </w:rPr>
+        <w:t xml:space="preserve">as I swore to you by YIHOVEH ELOHEI of Isra’el, ‘Your son Shlomo will be king after me; he will sit on my throne in my place,’ so will I do today.”</w:t>
+      </w:r>
+    </w:p>
+    <w:p>
+      <w:pPr>
+        <w:numPr>
+          <w:ilvl w:val="0"/>
+          <w:numId w:val="1"/>
+        </w:numPr>
+        <w:ind w:left="720" w:hanging="360"/>
+        <w:rPr>
+          <w:sz w:val="24"/>
+          <w:szCs w:val="24"/>
+          <w:u w:val="none"/>
+        </w:rPr>
+      </w:pPr>
+      <w:r>
+        <w:rPr>
+          <w:sz w:val="24"/>
+          <w:szCs w:val="24"/>
+          <w:rtl w:val="0"/>
+        </w:rPr>
+        <w:t xml:space="preserve">Bat-Sheva bowed with her face to the ground, prostrating herself to the king, and said, “Let my lord King David live forever.”</w:t>
+      </w:r>
+    </w:p>
+    <w:p>
+      <w:pPr>
+        <w:numPr>
+          <w:ilvl w:val="0"/>
+          <w:numId w:val="1"/>
+        </w:numPr>
+        <w:ind w:left="720" w:hanging="360"/>
+        <w:rPr>
+          <w:sz w:val="24"/>
+          <w:szCs w:val="24"/>
+          <w:u w:val="none"/>
+        </w:rPr>
+      </w:pPr>
+      <w:r>
+        <w:rPr>
+          <w:sz w:val="24"/>
+          <w:szCs w:val="24"/>
+          <w:rtl w:val="0"/>
+        </w:rPr>
+        <w:t xml:space="preserve">King David said, “Summon Tzadok the cohen, Natan the prophet and B’nayah the son of Y’hoyada.” They came before the king.</w:t>
+      </w:r>
+    </w:p>
+    <w:p>
+      <w:pPr>
+        <w:numPr>
+          <w:ilvl w:val="0"/>
+          <w:numId w:val="1"/>
+        </w:numPr>
+        <w:ind w:left="720" w:hanging="360"/>
+        <w:rPr>
+          <w:sz w:val="24"/>
+          <w:szCs w:val="24"/>
+          <w:u w:val="none"/>
+        </w:rPr>
+      </w:pPr>
+      <w:r>
+        <w:rPr>
+          <w:sz w:val="24"/>
+          <w:szCs w:val="24"/>
+          <w:rtl w:val="0"/>
+        </w:rPr>
+        <w:t xml:space="preserve">The king said to them, “Take with you the servants of your lord, have Shlomo my son ride on my own mule and bring him down to Gichon.</w:t>
+      </w:r>
+    </w:p>
+    <w:p>
+      <w:pPr>
+        <w:numPr>
+          <w:ilvl w:val="0"/>
+          <w:numId w:val="1"/>
+        </w:numPr>
+        <w:ind w:left="720" w:hanging="360"/>
+        <w:rPr>
+          <w:sz w:val="24"/>
+          <w:szCs w:val="24"/>
+          <w:u w:val="none"/>
+        </w:rPr>
+      </w:pPr>
+      <w:r>
+        <w:rPr>
+          <w:sz w:val="24"/>
+          <w:szCs w:val="24"/>
+          <w:rtl w:val="0"/>
+        </w:rPr>
+        <w:t xml:space="preserve">There Tzadok the cohen and Natan the prophet are to anoint him king over Isra’el. Sound the shofar and say, “Long live King Shlomo!”</w:t>
+      </w:r>
+    </w:p>
+    <w:p>
+      <w:pPr>
+        <w:numPr>
+          <w:ilvl w:val="0"/>
+          <w:numId w:val="1"/>
+        </w:numPr>
+        <w:ind w:left="720" w:hanging="360"/>
+        <w:rPr>
+          <w:sz w:val="24"/>
+          <w:szCs w:val="24"/>
+          <w:u w:val="none"/>
+        </w:rPr>
+      </w:pPr>
+      <w:r>
+        <w:rPr>
+          <w:sz w:val="24"/>
+          <w:szCs w:val="24"/>
+          <w:rtl w:val="0"/>
+        </w:rPr>
+        <w:t xml:space="preserve">Then escort him back; he is to come and sit on my throne; for he is to take my place as king. I have appointed him to rule over Isra’el and Y’hudah.”</w:t>
+      </w:r>
+    </w:p>
+    <w:p>
+      <w:pPr>
+        <w:numPr>
+          <w:ilvl w:val="0"/>
+          <w:numId w:val="1"/>
+        </w:numPr>
+        <w:ind w:left="720" w:hanging="360"/>
+        <w:rPr>
+          <w:sz w:val="24"/>
+          <w:szCs w:val="24"/>
+          <w:u w:val="none"/>
+        </w:rPr>
+      </w:pPr>
+      <w:r>
+        <w:rPr>
+          <w:sz w:val="24"/>
+          <w:szCs w:val="24"/>
+          <w:rtl w:val="0"/>
+        </w:rPr>
+        <w:t xml:space="preserve">B’nayah responded to the king by saying, “Amen! May YIHOVEH ELOHEI of my lord the king, confirm it!</w:t>
+      </w:r>
+    </w:p>
+    <w:p>
+      <w:pPr>
+        <w:numPr>
+          <w:ilvl w:val="0"/>
+          <w:numId w:val="1"/>
+        </w:numPr>
+        <w:ind w:left="720" w:hanging="360"/>
+        <w:rPr>
+          <w:sz w:val="24"/>
+          <w:szCs w:val="24"/>
+          <w:u w:val="none"/>
+        </w:rPr>
+      </w:pPr>
+      <w:r>
+        <w:rPr>
+          <w:sz w:val="24"/>
+          <w:szCs w:val="24"/>
+          <w:rtl w:val="0"/>
+        </w:rPr>
+        <w:t xml:space="preserve">Just as YIHOVEH has been with my lord the king, so may he be with Shlomo and make his throne even greater than the throne of my lord King David!”</w:t>
+      </w:r>
+    </w:p>
+    <w:p>
+      <w:pPr>
+        <w:numPr>
+          <w:ilvl w:val="0"/>
+          <w:numId w:val="1"/>
+        </w:numPr>
+        <w:ind w:left="720" w:hanging="360"/>
+        <w:rPr>
+          <w:sz w:val="24"/>
+          <w:szCs w:val="24"/>
+          <w:u w:val="none"/>
+        </w:rPr>
+      </w:pPr>
+      <w:r>
+        <w:rPr>
+          <w:sz w:val="24"/>
+          <w:szCs w:val="24"/>
+          <w:rtl w:val="0"/>
+        </w:rPr>
+        <w:t xml:space="preserve">So Tzadok the cohen, Natan the prophet, B’nayah the son of Y’hoyada and the K’reti and P’leti went down, had Shlomo ride on King David’s mule and brought him to Gichon.</w:t>
+      </w:r>
+    </w:p>
+    <w:p>
+      <w:pPr>
+        <w:numPr>
+          <w:ilvl w:val="0"/>
+          <w:numId w:val="1"/>
+        </w:numPr>
+        <w:ind w:left="720" w:hanging="360"/>
+        <w:rPr>
+          <w:sz w:val="24"/>
+          <w:szCs w:val="24"/>
+          <w:u w:val="none"/>
+        </w:rPr>
+      </w:pPr>
+      <w:r>
+        <w:rPr>
+          <w:sz w:val="24"/>
+          <w:szCs w:val="24"/>
+          <w:rtl w:val="0"/>
+        </w:rPr>
+        <w:t xml:space="preserve">Tzadok the cohen took the horn of olive oil out of the tent and anointed Shlomo. They sounded the shofar, and all the people shouted, “Long live King Shlomo!”</w:t>
+      </w:r>
+    </w:p>
+    <w:p>
+      <w:pPr>
+        <w:numPr>
+          <w:ilvl w:val="0"/>
+          <w:numId w:val="1"/>
+        </w:numPr>
+        <w:ind w:left="720" w:hanging="360"/>
+        <w:rPr>
+          <w:sz w:val="24"/>
+          <w:szCs w:val="24"/>
+          <w:u w:val="none"/>
+        </w:rPr>
+      </w:pPr>
+      <w:r>
+        <w:rPr>
+          <w:sz w:val="24"/>
+          <w:szCs w:val="24"/>
+          <w:rtl w:val="0"/>
+        </w:rPr>
+        <w:t xml:space="preserve">All the people escorted him back, playing flutes and rejoicing greatly, so that the earth shook with the sound.</w:t>
+      </w:r>
+    </w:p>
+    <w:p>
+      <w:pPr>
+        <w:numPr>
+          <w:ilvl w:val="0"/>
+          <w:numId w:val="1"/>
+        </w:numPr>
+        <w:ind w:left="720" w:hanging="360"/>
+        <w:rPr>
+          <w:sz w:val="24"/>
+          <w:szCs w:val="24"/>
+          <w:u w:val="none"/>
+        </w:rPr>
+      </w:pPr>
+      <w:r>
+        <w:rPr>
+          <w:sz w:val="24"/>
+          <w:szCs w:val="24"/>
+          <w:rtl w:val="0"/>
+        </w:rPr>
+        <w:t xml:space="preserve">Adoniyah and all his guests heard it while they were finishing their meal; but it was Yo’av who, when he heard the blast on the shofar, asked, “That noise — what’s the meaning of this uproar in the city?”</w:t>
+      </w:r>
+    </w:p>
+    <w:p>
+      <w:pPr>
+        <w:numPr>
+          <w:ilvl w:val="0"/>
+          <w:numId w:val="1"/>
+        </w:numPr>
+        <w:ind w:left="720" w:hanging="360"/>
+        <w:rPr>
+          <w:sz w:val="24"/>
+          <w:szCs w:val="24"/>
+          <w:u w:val="none"/>
+        </w:rPr>
+      </w:pPr>
+      <w:r>
+        <w:rPr>
+          <w:sz w:val="24"/>
+          <w:szCs w:val="24"/>
+          <w:rtl w:val="0"/>
+        </w:rPr>
+        <w:t xml:space="preserve">While he was still speaking, there came Yonatan the son of Evyatar the cohen. Adoniyah said, “Come in! You’re a worthy man, so you must be bringing good news!”</w:t>
+      </w:r>
+    </w:p>
+    <w:p>
+      <w:pPr>
+        <w:ind w:left="720" w:firstLine="0"/>
+        <w:rPr>
+          <w:sz w:val="24"/>
+          <w:szCs w:val="24"/>
+        </w:rPr>
+      </w:pPr>
+      <w:r>
+        <w:rPr>
+          <w:rtl w:val="0"/>
+        </w:rPr>
+      </w:r>
+    </w:p>
+    <w:p>
+      <w:pPr>
+        <w:ind w:left="720" w:firstLine="0"/>
+        <w:rPr>
+          <w:sz w:val="24"/>
+          <w:szCs w:val="24"/>
+        </w:rPr>
+      </w:pPr>
+      <w:r>
+        <w:rPr>
+          <w:rtl w:val="0"/>
+        </w:rPr>
+      </w:r>
+    </w:p>
+    <w:p>
+      <w:pPr>
+        <w:jc w:val="center"/>
+        <w:rPr>
+          <w:b w:val="1"/>
+          <w:bCs w:val="1"/>
+          <w:color w:val="999999"/>
+          <w:sz w:val="24"/>
+          <w:szCs w:val="24"/>
+        </w:rPr>
+      </w:pPr>
+      <w:r>
+        <w:rPr>
+          <w:b w:val="1"/>
+          <w:bCs w:val="1"/>
+          <w:color w:val="999999"/>
+          <w:sz w:val="24"/>
+          <w:szCs w:val="24"/>
+          <w:rtl w:val="0"/>
+        </w:rPr>
+        <w:t xml:space="preserve">Melekhim</w:t>
+      </w:r>
+    </w:p>
+    <w:p>
+      <w:pPr>
+        <w:jc w:val="center"/>
+        <w:rPr>
+          <w:sz w:val="24"/>
+          <w:szCs w:val="24"/>
         </w:rPr>
       </w:pPr>
       <w:r>
@@ -328,57 +1405,280 @@
         </w:rPr>
         <w:t xml:space="preserve">1</w:t>
       </w:r>
-    </w:p>
-    <w:p>
-      <w:pPr>
-        <w:rPr>
-          <w:b w:val="1"/>
-          <w:bCs w:val="1"/>
-          <w:sz w:val="24"/>
-          <w:szCs w:val="24"/>
-        </w:rPr>
-      </w:pPr>
-      <w:r>
-        <w:rPr>
-          <w:rtl w:val="0"/>
-        </w:rPr>
-      </w:r>
-    </w:p>
-    <w:p>
-      <w:pPr>
-        <w:rPr>
-          <w:b w:val="1"/>
-          <w:bCs w:val="1"/>
-          <w:sz w:val="24"/>
-          <w:szCs w:val="24"/>
-        </w:rPr>
-      </w:pPr>
-      <w:r>
-        <w:rPr>
-          <w:rtl w:val="0"/>
-        </w:rPr>
-      </w:r>
-    </w:p>
-    <w:p>
-      <w:pPr>
-        <w:numPr>
-          <w:ilvl w:val="0"/>
-          <w:numId w:val="1"/>
-        </w:numPr>
-        <w:ind w:left="720" w:hanging="360"/>
-        <w:rPr>
-          <w:sz w:val="24"/>
-          <w:szCs w:val="24"/>
-          <w:u w:val="none"/>
-        </w:rPr>
-      </w:pPr>
-      <w:r>
-        <w:rPr>
-          <w:sz w:val="24"/>
-          <w:szCs w:val="24"/>
-          <w:rtl w:val="0"/>
-        </w:rPr>
-        <w:t xml:space="preserve">Text</w:t>
+      <w:r>
+        <w:rPr>
+          <w:rtl w:val="0"/>
+        </w:rPr>
+      </w:r>
+    </w:p>
+    <w:p>
+      <w:pPr>
+        <w:ind w:left="720" w:firstLine="0"/>
+        <w:rPr>
+          <w:sz w:val="24"/>
+          <w:szCs w:val="24"/>
+        </w:rPr>
+      </w:pPr>
+      <w:r>
+        <w:rPr>
+          <w:rtl w:val="0"/>
+        </w:rPr>
+      </w:r>
+    </w:p>
+    <w:p>
+      <w:pPr>
+        <w:ind w:left="720" w:firstLine="0"/>
+        <w:rPr>
+          <w:sz w:val="24"/>
+          <w:szCs w:val="24"/>
+        </w:rPr>
+      </w:pPr>
+      <w:r>
+        <w:rPr>
+          <w:rtl w:val="0"/>
+        </w:rPr>
+      </w:r>
+    </w:p>
+    <w:p>
+      <w:pPr>
+        <w:numPr>
+          <w:ilvl w:val="0"/>
+          <w:numId w:val="1"/>
+        </w:numPr>
+        <w:ind w:left="720" w:hanging="360"/>
+        <w:rPr>
+          <w:sz w:val="24"/>
+          <w:szCs w:val="24"/>
+          <w:u w:val="none"/>
+        </w:rPr>
+      </w:pPr>
+      <w:r>
+        <w:rPr>
+          <w:sz w:val="24"/>
+          <w:szCs w:val="24"/>
+          <w:rtl w:val="0"/>
+        </w:rPr>
+        <w:t xml:space="preserve">Yonatan answered Adoniyah, “The truth is, our lord King David has made Shlomo king.</w:t>
+      </w:r>
+    </w:p>
+    <w:p>
+      <w:pPr>
+        <w:numPr>
+          <w:ilvl w:val="0"/>
+          <w:numId w:val="1"/>
+        </w:numPr>
+        <w:ind w:left="720" w:hanging="360"/>
+        <w:rPr>
+          <w:sz w:val="24"/>
+          <w:szCs w:val="24"/>
+          <w:u w:val="none"/>
+        </w:rPr>
+      </w:pPr>
+      <w:r>
+        <w:rPr>
+          <w:sz w:val="24"/>
+          <w:szCs w:val="24"/>
+          <w:rtl w:val="0"/>
+        </w:rPr>
+        <w:t xml:space="preserve">Moreover, the king sent with him Tzadok the cohen, Natan the prophet, B’nayah the son of Y’hoyada and the K’reti and P’leti; they had him ride on the king’s mule;</w:t>
+      </w:r>
+    </w:p>
+    <w:p>
+      <w:pPr>
+        <w:numPr>
+          <w:ilvl w:val="0"/>
+          <w:numId w:val="1"/>
+        </w:numPr>
+        <w:ind w:left="720" w:hanging="360"/>
+        <w:rPr>
+          <w:sz w:val="24"/>
+          <w:szCs w:val="24"/>
+          <w:u w:val="none"/>
+        </w:rPr>
+      </w:pPr>
+      <w:r>
+        <w:rPr>
+          <w:sz w:val="24"/>
+          <w:szCs w:val="24"/>
+          <w:rtl w:val="0"/>
+        </w:rPr>
+        <w:t xml:space="preserve">and Tzadok the cohen and Natan the prophet anointed him king in Gichon. Then they escorted him back from there rejoicing, so that the city is in an uproar; this is the noise you’ve been hearing.</w:t>
+      </w:r>
+    </w:p>
+    <w:p>
+      <w:pPr>
+        <w:numPr>
+          <w:ilvl w:val="0"/>
+          <w:numId w:val="1"/>
+        </w:numPr>
+        <w:ind w:left="720" w:hanging="360"/>
+        <w:rPr>
+          <w:sz w:val="24"/>
+          <w:szCs w:val="24"/>
+          <w:u w:val="none"/>
+        </w:rPr>
+      </w:pPr>
+      <w:r>
+        <w:rPr>
+          <w:sz w:val="24"/>
+          <w:szCs w:val="24"/>
+          <w:rtl w:val="0"/>
+        </w:rPr>
+        <w:t xml:space="preserve">Moreover, Shlomo is now sitting on the throne of the kingdom.</w:t>
+      </w:r>
+    </w:p>
+    <w:p>
+      <w:pPr>
+        <w:numPr>
+          <w:ilvl w:val="0"/>
+          <w:numId w:val="1"/>
+        </w:numPr>
+        <w:ind w:left="720" w:hanging="360"/>
+        <w:rPr>
+          <w:sz w:val="24"/>
+          <w:szCs w:val="24"/>
+          <w:u w:val="none"/>
+        </w:rPr>
+      </w:pPr>
+      <w:r>
+        <w:rPr>
+          <w:sz w:val="24"/>
+          <w:szCs w:val="24"/>
+          <w:rtl w:val="0"/>
+        </w:rPr>
+        <w:t xml:space="preserve">More than that, the king’s servants came and blessed our lord King David with these words: ‘May Elohim make the name of Shlomo better than your name and his throne greater than your throne,’ after which the king bowed down on the bed.</w:t>
+      </w:r>
+    </w:p>
+    <w:p>
+      <w:pPr>
+        <w:numPr>
+          <w:ilvl w:val="0"/>
+          <w:numId w:val="1"/>
+        </w:numPr>
+        <w:ind w:left="720" w:hanging="360"/>
+        <w:rPr>
+          <w:sz w:val="24"/>
+          <w:szCs w:val="24"/>
+          <w:u w:val="none"/>
+        </w:rPr>
+      </w:pPr>
+      <w:r>
+        <w:rPr>
+          <w:sz w:val="24"/>
+          <w:szCs w:val="24"/>
+          <w:rtl w:val="0"/>
+        </w:rPr>
+        <w:t xml:space="preserve">Finally, the king said, ‘Blessed be YIHOVEH ELOHEI of Isra’el, who has given someone to sit on my throne today, when my own eyes can see it.’”</w:t>
+      </w:r>
+    </w:p>
+    <w:p>
+      <w:pPr>
+        <w:numPr>
+          <w:ilvl w:val="0"/>
+          <w:numId w:val="1"/>
+        </w:numPr>
+        <w:ind w:left="720" w:hanging="360"/>
+        <w:rPr>
+          <w:sz w:val="24"/>
+          <w:szCs w:val="24"/>
+          <w:u w:val="none"/>
+        </w:rPr>
+      </w:pPr>
+      <w:r>
+        <w:rPr>
+          <w:sz w:val="24"/>
+          <w:szCs w:val="24"/>
+          <w:rtl w:val="0"/>
+        </w:rPr>
+        <w:t xml:space="preserve">At this all Adoniyah’s guests grew frightened; they got up, everyone going his own way.</w:t>
+      </w:r>
+    </w:p>
+    <w:p>
+      <w:pPr>
+        <w:numPr>
+          <w:ilvl w:val="0"/>
+          <w:numId w:val="1"/>
+        </w:numPr>
+        <w:ind w:left="720" w:hanging="360"/>
+        <w:rPr>
+          <w:sz w:val="24"/>
+          <w:szCs w:val="24"/>
+          <w:u w:val="none"/>
+        </w:rPr>
+      </w:pPr>
+      <w:r>
+        <w:rPr>
+          <w:sz w:val="24"/>
+          <w:szCs w:val="24"/>
+          <w:rtl w:val="0"/>
+        </w:rPr>
+        <w:t xml:space="preserve">Adoniyah too was afraid because of Shlomo; he got up, went and took hold of the horns of the altar.</w:t>
+      </w:r>
+    </w:p>
+    <w:p>
+      <w:pPr>
+        <w:numPr>
+          <w:ilvl w:val="0"/>
+          <w:numId w:val="1"/>
+        </w:numPr>
+        <w:ind w:left="720" w:hanging="360"/>
+        <w:rPr>
+          <w:sz w:val="24"/>
+          <w:szCs w:val="24"/>
+          <w:u w:val="none"/>
+        </w:rPr>
+      </w:pPr>
+      <w:r>
+        <w:rPr>
+          <w:sz w:val="24"/>
+          <w:szCs w:val="24"/>
+          <w:rtl w:val="0"/>
+        </w:rPr>
+        <w:t xml:space="preserve">Shlomo was told, “Here, Adoniyah is terrified of King Shlomo; he has grabbed hold of the horns of the altar and is saying, ‘First let King Shlomo swear to me that he will not have his servant executed.’”</w:t>
+      </w:r>
+    </w:p>
+    <w:p>
+      <w:pPr>
+        <w:numPr>
+          <w:ilvl w:val="0"/>
+          <w:numId w:val="1"/>
+        </w:numPr>
+        <w:ind w:left="720" w:hanging="360"/>
+        <w:rPr>
+          <w:sz w:val="24"/>
+          <w:szCs w:val="24"/>
+          <w:u w:val="none"/>
+        </w:rPr>
+      </w:pPr>
+      <w:r>
+        <w:rPr>
+          <w:sz w:val="24"/>
+          <w:szCs w:val="24"/>
+          <w:rtl w:val="0"/>
+        </w:rPr>
+        <w:t xml:space="preserve">Shlomo said, “If he will demonstrate that he is a worthy man, not a hair of his will fall to the earth. But if he is found making trouble, he will die.”</w:t>
+      </w:r>
+    </w:p>
+    <w:p>
+      <w:pPr>
+        <w:numPr>
+          <w:ilvl w:val="0"/>
+          <w:numId w:val="1"/>
+        </w:numPr>
+        <w:ind w:left="720" w:hanging="360"/>
+        <w:rPr>
+          <w:sz w:val="24"/>
+          <w:szCs w:val="24"/>
+          <w:u w:val="none"/>
+        </w:rPr>
+      </w:pPr>
+      <w:r>
+        <w:rPr>
+          <w:sz w:val="24"/>
+          <w:szCs w:val="24"/>
+          <w:rtl w:val="0"/>
+        </w:rPr>
+        <w:t xml:space="preserve">So King Shlomo sent, and they brought him down from the altar. He came and prostrated himself before King Shlomo; and Shlomo said to him, ‘Go on home.’”</w:t>
       </w:r>
     </w:p>
     <w:sectPr>

</xml_diff>